<commit_message>
Fonts & Health System Import
</commit_message>
<xml_diff>
--- a/Трое погрязли в дерьме.docx
+++ b/Трое погрязли в дерьме.docx
@@ -140,21 +140,7 @@
         <w:rPr>
           <w:lang w:val="ru-RU"/>
         </w:rPr>
-        <w:t xml:space="preserve">Средний урон, среднее </w:t>
-      </w:r>
-      <w:proofErr w:type="spellStart"/>
-      <w:r>
-        <w:rPr>
-          <w:lang w:val="ru-RU"/>
-        </w:rPr>
-        <w:t>хп</w:t>
-      </w:r>
-      <w:proofErr w:type="spellEnd"/>
-      <w:r>
-        <w:rPr>
-          <w:lang w:val="ru-RU"/>
-        </w:rPr>
-        <w:t xml:space="preserve"> и средняя громкость.</w:t>
+        <w:t>Средний урон, среднее хп и средняя громкость.</w:t>
       </w:r>
     </w:p>
     <w:p>
@@ -234,21 +220,7 @@
         <w:rPr>
           <w:lang w:val="ru-RU"/>
         </w:rPr>
-        <w:t xml:space="preserve">Малое </w:t>
-      </w:r>
-      <w:proofErr w:type="spellStart"/>
-      <w:r>
-        <w:rPr>
-          <w:lang w:val="ru-RU"/>
-        </w:rPr>
-        <w:t>хп</w:t>
-      </w:r>
-      <w:proofErr w:type="spellEnd"/>
-      <w:r>
-        <w:rPr>
-          <w:lang w:val="ru-RU"/>
-        </w:rPr>
-        <w:t>, атаки нет. Тихая.</w:t>
+        <w:t>Малое хп, атаки нет. Тихая.</w:t>
       </w:r>
     </w:p>
     <w:p>
@@ -331,16 +303,8 @@
         <w:rPr>
           <w:lang w:val="ru-RU"/>
         </w:rPr>
-        <w:t xml:space="preserve">Большой урон и большой </w:t>
-      </w:r>
-      <w:proofErr w:type="spellStart"/>
-      <w:r>
-        <w:rPr>
-          <w:lang w:val="ru-RU"/>
-        </w:rPr>
-        <w:t>хп</w:t>
-      </w:r>
-      <w:proofErr w:type="spellEnd"/>
+        <w:t>Большой урон и большой хп</w:t>
+      </w:r>
       <w:r>
         <w:rPr>
           <w:lang w:val="ru-RU"/>
@@ -379,6 +343,33 @@
         <w:rPr>
           <w:lang w:val="ru-RU"/>
         </w:rPr>
+        <w:t>Манекен</w:t>
+      </w:r>
+    </w:p>
+    <w:p>
+      <w:pPr>
+        <w:rPr>
+          <w:lang w:val="ru-RU"/>
+        </w:rPr>
+      </w:pPr>
+      <w:r>
+        <w:rPr>
+          <w:lang w:val="ru-RU"/>
+        </w:rPr>
+        <w:t>Противник, не нападает. Имеет малое хп, стоит на месте.</w:t>
+      </w:r>
+    </w:p>
+    <w:p>
+      <w:pPr>
+        <w:pStyle w:val="Heading2"/>
+        <w:rPr>
+          <w:lang w:val="ru-RU"/>
+        </w:rPr>
+      </w:pPr>
+      <w:r>
+        <w:rPr>
+          <w:lang w:val="ru-RU"/>
+        </w:rPr>
         <w:t>Гоблин</w:t>
       </w:r>
     </w:p>
@@ -404,21 +395,7 @@
         <w:rPr>
           <w:lang w:val="ru-RU"/>
         </w:rPr>
-        <w:t xml:space="preserve"> Имеет среднее </w:t>
-      </w:r>
-      <w:proofErr w:type="spellStart"/>
-      <w:r>
-        <w:rPr>
-          <w:lang w:val="ru-RU"/>
-        </w:rPr>
-        <w:t>хп</w:t>
-      </w:r>
-      <w:proofErr w:type="spellEnd"/>
-      <w:r>
-        <w:rPr>
-          <w:lang w:val="ru-RU"/>
-        </w:rPr>
-        <w:t>, среднюю скорость передвижения</w:t>
+        <w:t xml:space="preserve"> Имеет среднее хп, среднюю скорость передвижения</w:t>
       </w:r>
       <w:r>
         <w:rPr>
@@ -438,6 +415,7 @@
         <w:rPr>
           <w:lang w:val="ru-RU"/>
         </w:rPr>
+        <w:lastRenderedPageBreak/>
         <w:t>Лучник</w:t>
       </w:r>
     </w:p>
@@ -463,21 +441,7 @@
         <w:rPr>
           <w:lang w:val="ru-RU"/>
         </w:rPr>
-        <w:t xml:space="preserve">Имеет маленькое </w:t>
-      </w:r>
-      <w:proofErr w:type="spellStart"/>
-      <w:r>
-        <w:rPr>
-          <w:lang w:val="ru-RU"/>
-        </w:rPr>
-        <w:t>хп</w:t>
-      </w:r>
-      <w:proofErr w:type="spellEnd"/>
-      <w:r>
-        <w:rPr>
-          <w:lang w:val="ru-RU"/>
-        </w:rPr>
-        <w:t xml:space="preserve">, быструю скорость передвижения, </w:t>
+        <w:t xml:space="preserve">Имеет маленькое хп, быструю скорость передвижения, </w:t>
       </w:r>
       <w:r>
         <w:rPr>
@@ -497,7 +461,6 @@
         <w:rPr>
           <w:lang w:val="ru-RU"/>
         </w:rPr>
-        <w:lastRenderedPageBreak/>
         <w:t>Элементы</w:t>
       </w:r>
       <w:r>
@@ -605,19 +568,11 @@
           <w:lang w:val="ru-RU"/>
         </w:rPr>
       </w:pPr>
-      <w:proofErr w:type="spellStart"/>
-      <w:r>
-        <w:rPr>
-          <w:lang w:val="ru-RU"/>
-        </w:rPr>
-        <w:t>Хилит</w:t>
-      </w:r>
-      <w:proofErr w:type="spellEnd"/>
-      <w:r>
-        <w:rPr>
-          <w:lang w:val="ru-RU"/>
-        </w:rPr>
-        <w:t xml:space="preserve"> игрока.</w:t>
+      <w:r>
+        <w:rPr>
+          <w:lang w:val="ru-RU"/>
+        </w:rPr>
+        <w:t>Хилит игрока.</w:t>
       </w:r>
     </w:p>
     <w:p>
@@ -815,7 +770,13 @@
         <w:t xml:space="preserve"> Уровень 3</w:t>
       </w:r>
       <w:r>
-        <w:t>x1</w:t>
+        <w:t>x</w:t>
+      </w:r>
+      <w:r>
+        <w:rPr>
+          <w:lang w:val="ru-RU"/>
+        </w:rPr>
+        <w:t>1</w:t>
       </w:r>
       <w:r>
         <w:rPr>
@@ -878,6 +839,7 @@
           <w:bCs/>
           <w:lang w:val="ru-RU"/>
         </w:rPr>
+        <w:lastRenderedPageBreak/>
         <w:t>Комната 2</w:t>
       </w:r>
       <w:r>
@@ -943,7 +905,6 @@
         <w:rPr>
           <w:lang w:val="ru-RU"/>
         </w:rPr>
-        <w:lastRenderedPageBreak/>
         <w:t>Обучение за Ящерку</w:t>
       </w:r>
     </w:p>
@@ -1216,6 +1177,7 @@
         <w:rPr>
           <w:noProof/>
         </w:rPr>
+        <w:lastRenderedPageBreak/>
         <w:drawing>
           <wp:inline distT="0" distB="0" distL="0" distR="0" wp14:anchorId="70350ABB" wp14:editId="10FCB52E">
             <wp:extent cx="4190338" cy="2095385"/>
@@ -1294,7 +1256,6 @@
           <w:bCs/>
           <w:lang w:val="ru-RU"/>
         </w:rPr>
-        <w:lastRenderedPageBreak/>
         <w:t>Комната 2.</w:t>
       </w:r>
       <w:r>

</xml_diff>

<commit_message>
Canvas UI edits & зачатие Health system
</commit_message>
<xml_diff>
--- a/Трое погрязли в дерьме.docx
+++ b/Трое погрязли в дерьме.docx
@@ -73,6 +73,34 @@
         <w:rPr>
           <w:lang w:val="ru-RU"/>
         </w:rPr>
+        <w:t xml:space="preserve">У игрока 10 </w:t>
+      </w:r>
+      <w:proofErr w:type="spellStart"/>
+      <w:r>
+        <w:rPr>
+          <w:lang w:val="ru-RU"/>
+        </w:rPr>
+        <w:t>хп</w:t>
+      </w:r>
+      <w:proofErr w:type="spellEnd"/>
+      <w:r>
+        <w:rPr>
+          <w:lang w:val="ru-RU"/>
+        </w:rPr>
+        <w:t>.</w:t>
+      </w:r>
+    </w:p>
+    <w:p>
+      <w:pPr>
+        <w:ind w:left="720" w:hanging="360"/>
+        <w:rPr>
+          <w:lang w:val="ru-RU"/>
+        </w:rPr>
+      </w:pPr>
+      <w:r>
+        <w:rPr>
+          <w:lang w:val="ru-RU"/>
+        </w:rPr>
         <w:t>Игрок переключается между тремя сущностями:</w:t>
       </w:r>
     </w:p>
@@ -140,7 +168,21 @@
         <w:rPr>
           <w:lang w:val="ru-RU"/>
         </w:rPr>
-        <w:t>Средний урон, среднее хп и средняя громкость.</w:t>
+        <w:t xml:space="preserve">Средний урон, среднее </w:t>
+      </w:r>
+      <w:proofErr w:type="spellStart"/>
+      <w:r>
+        <w:rPr>
+          <w:lang w:val="ru-RU"/>
+        </w:rPr>
+        <w:t>хп</w:t>
+      </w:r>
+      <w:proofErr w:type="spellEnd"/>
+      <w:r>
+        <w:rPr>
+          <w:lang w:val="ru-RU"/>
+        </w:rPr>
+        <w:t xml:space="preserve"> и средняя громкость.</w:t>
       </w:r>
     </w:p>
     <w:p>
@@ -220,7 +262,21 @@
         <w:rPr>
           <w:lang w:val="ru-RU"/>
         </w:rPr>
-        <w:t>Малое хп, атаки нет. Тихая.</w:t>
+        <w:t xml:space="preserve">Малое </w:t>
+      </w:r>
+      <w:proofErr w:type="spellStart"/>
+      <w:r>
+        <w:rPr>
+          <w:lang w:val="ru-RU"/>
+        </w:rPr>
+        <w:t>хп</w:t>
+      </w:r>
+      <w:proofErr w:type="spellEnd"/>
+      <w:r>
+        <w:rPr>
+          <w:lang w:val="ru-RU"/>
+        </w:rPr>
+        <w:t>, атаки нет. Тихая.</w:t>
       </w:r>
     </w:p>
     <w:p>
@@ -303,8 +359,16 @@
         <w:rPr>
           <w:lang w:val="ru-RU"/>
         </w:rPr>
-        <w:t>Большой урон и большой хп</w:t>
-      </w:r>
+        <w:t xml:space="preserve">Большой урон и большой </w:t>
+      </w:r>
+      <w:proofErr w:type="spellStart"/>
+      <w:r>
+        <w:rPr>
+          <w:lang w:val="ru-RU"/>
+        </w:rPr>
+        <w:t>хп</w:t>
+      </w:r>
+      <w:proofErr w:type="spellEnd"/>
       <w:r>
         <w:rPr>
           <w:lang w:val="ru-RU"/>
@@ -356,7 +420,33 @@
         <w:rPr>
           <w:lang w:val="ru-RU"/>
         </w:rPr>
-        <w:t>Противник, не нападает. Имеет малое хп, стоит на месте.</w:t>
+        <w:t xml:space="preserve">Противник, не нападает. Имеет </w:t>
+      </w:r>
+      <w:r>
+        <w:rPr>
+          <w:lang w:val="ru-RU"/>
+        </w:rPr>
+        <w:t>4</w:t>
+      </w:r>
+      <w:r>
+        <w:rPr>
+          <w:lang w:val="ru-RU"/>
+        </w:rPr>
+        <w:t xml:space="preserve"> </w:t>
+      </w:r>
+      <w:proofErr w:type="spellStart"/>
+      <w:r>
+        <w:rPr>
+          <w:lang w:val="ru-RU"/>
+        </w:rPr>
+        <w:t>хп</w:t>
+      </w:r>
+      <w:proofErr w:type="spellEnd"/>
+      <w:r>
+        <w:rPr>
+          <w:lang w:val="ru-RU"/>
+        </w:rPr>
+        <w:t>, стоит на месте.</w:t>
       </w:r>
     </w:p>
     <w:p>
@@ -395,7 +485,33 @@
         <w:rPr>
           <w:lang w:val="ru-RU"/>
         </w:rPr>
-        <w:t xml:space="preserve"> Имеет среднее хп, среднюю скорость передвижения</w:t>
+        <w:t xml:space="preserve"> Имеет </w:t>
+      </w:r>
+      <w:r>
+        <w:rPr>
+          <w:lang w:val="ru-RU"/>
+        </w:rPr>
+        <w:t>6</w:t>
+      </w:r>
+      <w:r>
+        <w:rPr>
+          <w:lang w:val="ru-RU"/>
+        </w:rPr>
+        <w:t xml:space="preserve"> </w:t>
+      </w:r>
+      <w:proofErr w:type="spellStart"/>
+      <w:r>
+        <w:rPr>
+          <w:lang w:val="ru-RU"/>
+        </w:rPr>
+        <w:t>хп</w:t>
+      </w:r>
+      <w:proofErr w:type="spellEnd"/>
+      <w:r>
+        <w:rPr>
+          <w:lang w:val="ru-RU"/>
+        </w:rPr>
+        <w:t>, среднюю скорость передвижения</w:t>
       </w:r>
       <w:r>
         <w:rPr>
@@ -441,7 +557,33 @@
         <w:rPr>
           <w:lang w:val="ru-RU"/>
         </w:rPr>
-        <w:t xml:space="preserve">Имеет маленькое хп, быструю скорость передвижения, </w:t>
+        <w:t xml:space="preserve">Имеет </w:t>
+      </w:r>
+      <w:r>
+        <w:rPr>
+          <w:lang w:val="ru-RU"/>
+        </w:rPr>
+        <w:t>2</w:t>
+      </w:r>
+      <w:r>
+        <w:rPr>
+          <w:lang w:val="ru-RU"/>
+        </w:rPr>
+        <w:t xml:space="preserve"> </w:t>
+      </w:r>
+      <w:proofErr w:type="spellStart"/>
+      <w:r>
+        <w:rPr>
+          <w:lang w:val="ru-RU"/>
+        </w:rPr>
+        <w:t>хп</w:t>
+      </w:r>
+      <w:proofErr w:type="spellEnd"/>
+      <w:r>
+        <w:rPr>
+          <w:lang w:val="ru-RU"/>
+        </w:rPr>
+        <w:t xml:space="preserve">, быструю скорость передвижения, </w:t>
       </w:r>
       <w:r>
         <w:rPr>
@@ -568,11 +710,19 @@
           <w:lang w:val="ru-RU"/>
         </w:rPr>
       </w:pPr>
-      <w:r>
-        <w:rPr>
-          <w:lang w:val="ru-RU"/>
-        </w:rPr>
-        <w:t>Хилит игрока.</w:t>
+      <w:proofErr w:type="spellStart"/>
+      <w:r>
+        <w:rPr>
+          <w:lang w:val="ru-RU"/>
+        </w:rPr>
+        <w:t>Хилит</w:t>
+      </w:r>
+      <w:proofErr w:type="spellEnd"/>
+      <w:r>
+        <w:rPr>
+          <w:lang w:val="ru-RU"/>
+        </w:rPr>
+        <w:t xml:space="preserve"> игрока.</w:t>
       </w:r>
     </w:p>
     <w:p>
@@ -839,7 +989,6 @@
           <w:bCs/>
           <w:lang w:val="ru-RU"/>
         </w:rPr>
-        <w:lastRenderedPageBreak/>
         <w:t>Комната 2</w:t>
       </w:r>
       <w:r>
@@ -873,6 +1022,7 @@
           <w:bCs/>
           <w:lang w:val="ru-RU"/>
         </w:rPr>
+        <w:lastRenderedPageBreak/>
         <w:t>Комната 3</w:t>
       </w:r>
       <w:r>
@@ -1177,7 +1327,6 @@
         <w:rPr>
           <w:noProof/>
         </w:rPr>
-        <w:lastRenderedPageBreak/>
         <w:drawing>
           <wp:inline distT="0" distB="0" distL="0" distR="0" wp14:anchorId="70350ABB" wp14:editId="10FCB52E">
             <wp:extent cx="4190338" cy="2095385"/>
@@ -1227,6 +1376,7 @@
           <w:bCs/>
           <w:lang w:val="ru-RU"/>
         </w:rPr>
+        <w:lastRenderedPageBreak/>
         <w:t>Комната 1</w:t>
       </w:r>
       <w:r>

</xml_diff>